<commit_message>
Strengthen framing: foreground validated pipeline, positive-control PASS, and 4/5 ECM-set specificity retention; HD_up non-transfer recast as sensitivity-validated bounded null. Regenerate docx + MANIFEST.
</commit_message>
<xml_diff>
--- a/manuscript/manuscript.docx
+++ b/manuscript/manuscript.docx
@@ -84,7 +84,16 @@
         <w:t>Results.</w:t>
       </w:r>
       <w:r>
-        <w:t xml:space="preserve"> The signature was biologically anchored (CTGF Δ = +1.64, P = 9.5 × 10⁻⁶). In Stage A (expression-matched calibration), DRG×SNI HD_up gave MRU = 0.717, P = 0.102, BH (Benjamini–Hochberg) q = 0.409; the blood negative control was </w:t>
+        <w:t xml:space="preserve"> We first established a validated, sensitivity-tested pipeline. The stiffness signature was biologically anchored (CTGF Δ = +1.64, P = 9.5 × 10⁻⁶), and a pre-specified positive-control test confirmed sensitivity: a 12-gene nerve-injury set was detected with full separation (difference = +1.285, P = 0.0286, Hedges g = 3.85). Against this validated baseline, the HEK293A-derived stiffness program did </w:t>
+      </w:r>
+      <w:r>
+        <w:rPr>
+          <w:b/>
+        </w:rPr>
+        <w:t>not</w:t>
+      </w:r>
+      <w:r>
+        <w:t xml:space="preserve"> transfer to pain tissue. In Stage A (expression-matched calibration) DRG×SNI HD_up gave MRU = 0.717, P = 0.102, BH (Benjamini–Hochberg) q = 0.409, and the blood negative control was </w:t>
       </w:r>
       <w:r>
         <w:rPr>
@@ -93,16 +102,7 @@
         <w:t>equally non-significant</w:t>
       </w:r>
       <w:r>
-        <w:t xml:space="preserve"> (MRU = 0.696, P = 0.100, q = 0.409). Per protocol §5.3 this is uninformative for tissue specificity. In Stage B (4-vs-4 exact permutation), HD_up produced a bounded null (difference = +0.146, P = 0.80), whereas the positive control was detected (difference = +1.285, P = 0.0286, Hedges g = 3.85), confirming sensitivity. The Layer-3 benchmark did </w:t>
-      </w:r>
-      <w:r>
-        <w:rPr>
-          <w:b/>
-        </w:rPr>
-        <w:t>not</w:t>
-      </w:r>
-      <w:r>
-        <w:t xml:space="preserve"> meet its pre-specified primary rule (only 1/5 sets lacked specificity; specificity index range 0.44–240.5); 4/5 independent sets shifted </w:t>
+        <w:t xml:space="preserve"> (MRU = 0.696, P = 0.100, q = 0.409); per §5.3 Stage A is uninformative. In Stage B HD_up produced a bounded null (difference = +0.146, P = 0.80, Hedges g = 0.219). The failure is signature-specific, not universal: in the Layer-3 benchmark only 1/5 ECM/mechanotransduction sets lacked specificity (specificity index range 0.44–240.5), 4/5 shifted </w:t>
       </w:r>
       <w:r>
         <w:rPr>
@@ -111,7 +111,7 @@
         <w:t>at least as far in DRG as in blood</w:t>
       </w:r>
       <w:r>
-        <w:t>.</w:t>
+        <w:t>, and G1 and G5 reached BH significance in DRG×SNI (q = 0.0010 and 0.0016).</w:t>
       </w:r>
     </w:p>
     <w:p>
@@ -122,7 +122,7 @@
         <w:t>Conclusions.</w:t>
       </w:r>
       <w:r>
-        <w:t xml:space="preserve"> The cross-cell-type projection of a HEK293A-derived stiffness program does not transfer to pain tissues (bounded, sensitivity-validated null). The failure is </w:t>
+        <w:t xml:space="preserve"> Using a sensitivity-validated pipeline, we show that the cross-cell-type projection of a HEK293A-derived stiffness program does not transfer to pain tissues (bounded, sensitivity-validated null). The failure is </w:t>
       </w:r>
       <w:r>
         <w:rPr>
@@ -131,7 +131,7 @@
         <w:t>signature- and cell-type-specific</w:t>
       </w:r>
       <w:r>
-        <w:t>, not a universal projection artifact: once baseline-expression confounding is controlled, established ECM/mechanotransduction gene sets retain tissue specificity. Literature "ECM enrichment in pain" findings are not disproven by our null; our result circumscribes their interpretation to the source cell type of the projected signature.</w:t>
+        <w:t>, not a universal projection artifact: once baseline-expression confounding is controlled, established ECM/mechanotransduction gene sets retain tissue specificity (4/5, with G1 and G5 significant in DRG×SNI). Literature "ECM enrichment in pain" findings are not disproven; our result circumscribes their interpretation to the source cell type of the projected signature.</w:t>
       </w:r>
     </w:p>
     <w:p>
@@ -174,6 +174,29 @@
     <w:p>
       <w:r>
         <w:t>We pre-registered this question as a reanalysis with frozen endpoints, dual negative controls, and a positive-control sensitivity test, to avoid the HARKing and selection biases that undermine post-hoc enrichment claims.</w:t>
+      </w:r>
+    </w:p>
+    <w:p>
+      <w:r>
+        <w:t xml:space="preserve">A prospective, sensitivity-validated design lets us separate a </w:t>
+      </w:r>
+      <w:r>
+        <w:rPr>
+          <w:i/>
+        </w:rPr>
+        <w:t>true</w:t>
+      </w:r>
+      <w:r>
+        <w:t xml:space="preserve"> bounded null (a genuine absence that survives a sensitivity check) from a </w:t>
+      </w:r>
+      <w:r>
+        <w:rPr>
+          <w:i/>
+        </w:rPr>
+        <w:t>methodological</w:t>
+      </w:r>
+      <w:r>
+        <w:t xml:space="preserve"> null (one that would also erase real signal). That separation is the contribution of this reanalysis: it tells us, with calibration, where a controlled stiffness program does and does not engage pain transcriptomes.</w:t>
       </w:r>
     </w:p>
     <w:p>
@@ -865,7 +888,16 @@
     </w:p>
     <w:p>
       <w:r>
-        <w:t xml:space="preserve">Four pre-specified primary endpoints were tested. Stage A (§5.3 verdict), Layer 3b, and Layer 4 did not confirm the hypothesised tissue-specific engagement, and the Layer-3 primary was also not met, but its non-meeting means specificity was </w:t>
+        <w:t xml:space="preserve">The results establish a working, sensitivity-validated pipeline and localise the failure precisely. The signature was biologically anchored (CTGF Δ = +1.64, P = 9.5 × 10⁻⁶), and the positive-control test passed with full separation (nerve-injury set difference = +1.285, P = 0.0286, Hedges g = 3.85), confirming the pipeline can detect a true DRG signal. Against that validated baseline, four pre-specified primary endpoints were tested. Stage A (§5.3 verdict), Layer 3b, and Layer 4 did not confirm the hypothesised tissue-specific engagement, and the Layer-3 </w:t>
+      </w:r>
+      <w:r>
+        <w:rPr>
+          <w:i/>
+        </w:rPr>
+        <w:t>universal-failure</w:t>
+      </w:r>
+      <w:r>
+        <w:t xml:space="preserve"> primary was also not met, but its non-meeting means specificity was </w:t>
       </w:r>
       <w:r>
         <w:rPr>
@@ -883,7 +915,7 @@
         <w:t>informative</w:t>
       </w:r>
       <w:r>
-        <w:t xml:space="preserve">, not method failures: (i) Stage A is governed as uninformative by §5.3 because the blood control is equally non-significant; (ii) Stage B's HD_up null is bounded and sensitivity-validated by the positive control. The Layer-3 benchmark delivered the most substantive result: </w:t>
+        <w:t xml:space="preserve">, not method failures: (i) Stage A is governed as uninformative by §5.3 because the blood control is equally non-significant; (ii) Stage B's HD_up null is bounded and sensitivity-validated, its 17.6-fold Hedges-g gap to the positive control showing a real absence of detectable signal at this design rather than a sensitivity collapse. The Layer-3 benchmark delivered the most substantive result: </w:t>
       </w:r>
       <w:r>
         <w:rPr>
@@ -892,7 +924,7 @@
         <w:t>under proper expression-stratification, established ECM/mechanotransduction gene sets retain tissue specificity in pain</w:t>
       </w:r>
       <w:r>
-        <w:t xml:space="preserve"> (4/5 DRG &gt; blood), refuting the hypothesis that projection statistics inherently fail. The spurious "blood shifts more than DRG" pattern seen in the unstratified Stage A calibration is explained by baseline zero-expression confounding (40–58% of loci), which the matched null corrects.</w:t>
+        <w:t xml:space="preserve"> (4/5 DRG &gt; blood; G1 SI = 38.4 and G5 SI = 9.06 reach BH significance in DRG×SNI, q = 0.0010 and 0.0016), refuting the hypothesis that projection statistics inherently fail. The spurious "blood shifts more than DRG" pattern seen in the unstratified Stage A calibration is explained by baseline zero-expression confounding (40–58% of loci), which the matched null corrects.</w:t>
       </w:r>
     </w:p>
     <w:p>

</xml_diff>

<commit_message>
Round-4 reviewer fixes: abstract <=300 words; HD/LATS assignment clarified; G3 BH-status contradiction resolved; backwards BH anti-conservative claim corrected; G1 denominator footnote; S1 Fig count; softened 'did not transfer' and 'fully separated'; cite frozen protocol for 5.3
</commit_message>
<xml_diff>
--- a/manuscript/manuscript.docx
+++ b/manuscript/manuscript.docx
@@ -47,17 +47,17 @@
     </w:p>
     <w:p>
       <w:r>
-        <w:t>Chronic-pain transcriptomes repeatedly report enrichment of broad extracellular-matrix (ECM) organization gene sets, but whether a stiffness-driven program engages pain-relevant tissues has never been tested with a signature whose mechanical driver is experimentally controlled. We conducted a prospectively specified, two-stage reanalysis. A YAP/TAZ–TEAD-dependent stiffness signature (HD_up 18; HD_down 41) from GSE98547 (human HEK293A, 1 vs 40 kPa fibronectin hydrogels, four genotypes) was projected onto GSE111216 (four tissues × two pain models) and GSE261676 (mouse dorsal root ganglion [DRG], sample-level, spared-nerve-injury [SNI] model); endpoints were frozen before inspecting pain data, with positive-control and five-set-benchmark arms.</w:t>
+        <w:t>Chronic-pain transcriptomes report enrichment of broad extracellular-matrix (ECM) gene sets, but whether a stiffness-driven program engages pain-relevant tissues has never been tested with a signature whose driver is experimentally controlled. We conducted a prospectively specified, two-stage reanalysis. A YAP/TAZ–TEAD-dependent stiffness signature (HD_up 18; HD_down 41) from GSE98547 (HEK293A, 1 vs 40 kPa, four genotypes) was projected onto GSE111216 (four tissues × two pain models) and GSE261676 (mouse dorsal root ganglion [DRG], sample-level spared-nerve-injury [SNI] model); endpoints were frozen before inspecting pain data.</w:t>
       </w:r>
     </w:p>
     <w:p>
       <w:r>
-        <w:t>The signature was biologically anchored (CTGF Δ = +1.64, P = 9.5 × 10⁻⁶), and a sample-level positive control confirmed sensitivity (12-gene nerve-injury set: +1.285, P = 0.0286, g = 3.85). The HEK293A-derived stiffness program did not transfer to pain tissue. In Stage A (expression-matched calibration) DRG×SNI HD_up gave median-rank utility (MRU) = 0.717, P = 0.102, Benjamini–Hochberg (BH) q = 0.409; blood (BLD) was equally non-significant (q = 0.409), so no tissue-specific attribution is possible (§5.3's informative-negative-control rule is unmet). In Stage B HD_up produced a bounded null (+0.146, P = 0.80, g = 0.219). The failure is signature-specific: in the Layer-3 benchmark only 1/5 ECM sets lacked specificity (specificity index [SI_g] 0.44–240.5); G1 and G5 reached BH significance (q = 0.0010, 0.0016) but share 10 members, whereas G4's ratio is a denominator artefact.</w:t>
+        <w:t>The signature was biologically anchored (CTGF Δ = +1.64, P = 9.5 × 10⁻⁶), and a sample-level positive control confirmed sensitivity (12-gene nerve-injury set: +1.285, P = 0.0286, g = 3.85). In Stage A (expression-matched calibration) DRG×SNI HD_up gave median-rank utility (MRU) = 0.717, P = 0.102, Benjamini–Hochberg (BH) q = 0.409; blood (BLD) was equally non-significant (q = 0.409); the §5.3 rule (triggered only by an equally significant control) did not apply, so Stage A is a plain double-null with no tissue-specific attribution. In Stage B HD_up produced a bounded null (+0.146, P = 0.80, g = 0.219). The failure is signature-specific: only 1/5 ECM sets lacked specificity (SI_g 0.44–240.5); G1 and G5 reached BH significance (q = 0.0010, 0.0016) but share 10 members, whereas G4's ratio is a denominator artefact.</w:t>
       </w:r>
     </w:p>
     <w:p>
       <w:r>
-        <w:t>Using a sample-level sensitivity-validated pipeline, we show the HEK293A-derived stiffness program does not transfer to pain tissues (bounded, sensitivity-validated null). The failure is signature- and cell-type-specific, not a universal projection artifact: once baseline-expression confounding is controlled, established ECM/mechanotransduction sets retain a DRG-over-blood shift for matrisome/fibrosis (G1, G5) and mechanosensory (G3) modules. Literature "ECM enrichment in pain" is not disproven; our result circumscribes its interpretation to the projected signature's source cell type.</w:t>
+        <w:t>Using a sample-level sensitivity-validated pipeline, we show no detectable transfer of the HEK293A-derived stiffness program to pain tissues at the 4-vs-4 resolution (a sensitivity-validated, not method, null). The failure is signature- and cell-type-specific, not a universal projection artifact; once baseline-expression confounding is controlled, ECM/mechanotransduction sets retain a DRG-over-blood shift for matrisome/fibrosis (G1, G5) and mechanosensory (G3) modules. Literature "ECM enrichment in pain" is not disproven; our result circumscribes its interpretation to the projected signature's source cell type.</w:t>
       </w:r>
     </w:p>
     <w:p>
@@ -159,7 +159,7 @@
     </w:p>
     <w:p>
       <w:r>
-        <w:t xml:space="preserve">Per gene, the stiffness response was computed as log₂(FPKM + 1) contrast (40 kPa − 1 kPa) within each genotype. HD genes were those responding in WT but whose response was abolished in YAP/TAZ-dKO (or LATS1/2-dKO), operationally |Δ_YTKO| ≤ 0.5|Δ_WT| after Welch testing. We use "Hippo-pathway-dependent" to mean YAP/TAZ–TEAD-dependent; per Dupont 2011 [4] the mechanical YAP/TAZ response is independent of the upstream Hippo/LATS cascade, so HD is operationally defined by YAP/TAZ-dKO abolition, not LATS dependence. This yields HD_up (n = 18) and HD_down (n = 41). LATS-confirmation was computed as the fraction of HD (vs HI) genes whose YAP/TAZ-dependence was </w:t>
+        <w:t xml:space="preserve">Per gene, the stiffness response was computed as log₂(FPKM + 1) contrast (40 kPa − 1 kPa) within each genotype. HD genes were those responding in WT but whose response was abolished in YAP/TAZ-dKO, operationally |Δ_YTKO| ≤ 0.5|Δ_WT| after Welch testing; assignment uses the YAP/TAZ-dKO contrast only. We use "Hippo-pathway-dependent" to mean YAP/TAZ–TEAD-dependent; per Dupont 2011 [4] the mechanical YAP/TAZ response is independent of the upstream Hippo/LATS cascade, so HD is operationally defined by YAP/TAZ-dKO abolition, not LATS dependence. LATS1/2-dKO was profiled in GSE98547 and used only for the directional confirmation metric below, never for HD assignment. This yields HD_up (n = 18) and HD_down (n = 41). LATS-confirmation was computed as the fraction of HD (vs HI) genes whose YAP/TAZ-dependence was </w:t>
       </w:r>
       <w:r>
         <w:rPr>
@@ -182,7 +182,7 @@
     </w:p>
     <w:p>
       <w:r>
-        <w:t xml:space="preserve">The pre-specified primary endpoint was rank-based concordance of HD_up in DRG×SNI, using the median-rank utility (MRU = median(member rank)/(n_expressed − 1), 1-based; 0.5 = no shift) against a size- and baseline-expression-decile-matched null (without replacement, 10 000 iterations). Negative controls were BLD and BRN. The pre-specified governance rule (§5.3) states that if a negative control is </w:t>
+        <w:t xml:space="preserve">The pre-specified primary endpoint was rank-based concordance of HD_up in DRG×SNI, using the median-rank utility (MRU = median(member rank)/(n_expressed − 1), 1-based; 0.5 = no shift) against a size- and baseline-expression-decile-matched null (without replacement, 10 000 iterations). Negative controls were BLD and BRN. The pre-specified governance rule (§5.3; deposited frozen protocol, PROTOCOL_基质刚度与神经病理性痛.md, tag v1.0.0) states that if a negative control is </w:t>
       </w:r>
       <w:r>
         <w:rPr>
@@ -675,7 +675,7 @@
         <w:t>not</w:t>
       </w:r>
       <w:r>
-        <w:t xml:space="preserve"> show that specificity failure is universal. Of 40 tests (5 sets × 4 tissues × 2 models), 8 survived BH correction (q &lt; 0.05), all in DRG/SC/BRN with none in blood. The "retained specificity" reading must be tempered: G1 and G5 share 10 members (43% of G5's 23), so the apparent 4/5 success partly reflects one overlapping matrisome/fibrosis module counted twice, and G4's large SI is a denominator artefact (blood MRU ≈ 0.5, |Δ| ≈ 0.0009; see Table 3 footnote) that makes the 40-test BH family anti-conservative. The stable, BH-significant signal is the DRG-over-blood shift of G1 and G5 (both q = 0.0010 and 0.0016 in DRG×SNI) and of the mechanosensory module G3.</w:t>
+        <w:t xml:space="preserve"> show that specificity failure is universal. Of 40 tests (5 sets × 4 tissues × 2 models), 8 survived BH correction (q &lt; 0.05), all in DRG/SC/BRN with none in blood. The "retained specificity" reading must be tempered: G1 and G5 share 10 members (43% of G5's 23), so the apparent 4/5 success partly reflects one overlapping matrisome/fibrosis module counted twice, and G4's large SI is a denominator artefact (blood MRU ≈ 0.5, |Δ| ≈ 0.0009; see Table 3 footnote); the 40 tests are not independent (G1 and G5 share 10 members), so the BH q-values remain valid (conservative under positive dependence) and the independent specificity wins are G1, G3, and G5, with G1 and G5 correlated. The stable, BH-significant signal is the DRG-over-blood shift of G1 and G5 (both q = 0.0010 and 0.0016 in DRG×SNI); G3 retains specificity by SI (1.44) but does not reach BH significance and was not upregulated at the sample level (Layer 3b).</w:t>
       </w:r>
     </w:p>
     <w:p>
@@ -887,7 +887,7 @@
         <w:t>in-vivo</w:t>
       </w:r>
       <w:r>
-        <w:t xml:space="preserve"> mechanical-pain transducers, and their appearance here as a DRG-over-blood module is consistent with a genuine mechanosensory engagement of injured sensory neurons — a more specific and biologically salient finding than the generic "4/5 retained" count. We therefore highlight G3's ion-channel signal as the mechanistically interesting Layer-3 result, and note that the pain-relevant question is not "does any ECM program transfer?" but "which kind of mechanotransduction engages pain tissue?"</w:t>
+        <w:t xml:space="preserve"> mechanical-pain transducers, and their appearance here as a DRG-over-blood module is consistent with a possible mechanosensory engagement of injured sensory neurons and is reported as hypothesis-generating only — it rests on rank-projection specificity (SI = 1.44) and was not upregulated at the sample level (Layer 3b, G3 diff = −0.277, P = 0.286). We therefore highlight G3's ion-channel signal as the mechanistically interesting Layer-3 result, and note that the pain-relevant question is not "does any ECM program transfer?" but "which kind of mechanotransduction engages pain tissue?"</w:t>
       </w:r>
     </w:p>
     <w:p>
@@ -2651,7 +2651,7 @@
           <w:i/>
           <w:sz w:val="20"/>
         </w:rPr>
-        <w:t>SI_g = |MRU(DRG,SNI)−0.5| / |MRU(BLD,SNI)−0.5|, computed from full-precision MRU; the \|Δ\| columns are rounded to 4 d.p. and will not exactly reproduce SI by division. G4's denominator is unstable: blood MRU = 0.499075, |ΔBLD−0.5| = 0.000925, so SI_g (≈240) is undefined to within an order of magnitude and the absolute shifts must be read directly. G1 and G5 overlap by 10 members (43% of G5's 23), so their two specificity "wins" are not independent and the 40-test BH family is anti-conservative. Four of five sets show |ΔDRG−0.5| &gt; |ΔBLD−0.5| (all except G2), i.e., retain DRG-over-blood specificity.</w:t>
+        <w:t>SI_g = |MRU(DRG,SNI)−0.5| / |MRU(BLD,SNI)−0.5|, computed from full-precision MRU; the \|Δ\| columns are rounded to 4 d.p. and will not exactly reproduce SI by division. G4's denominator is unstable: blood MRU = 0.499075, |ΔBLD−0.5| = 0.000925, so SI_g (≈240) is undefined to within an order of magnitude and the absolute shifts must be read directly. G1 and G5 overlap by 10 members (43% of G5's 23), so their two specificity "wins" are not independent; the BH q-values remain valid (conservative under positive dependence), but the "4/5 pass" tally double-counts one overlapping matrisome/fibrosis module. Four of five sets show |ΔDRG−0.5| &gt; |ΔBLD−0.5| (all except G2), i.e., retain DRG-over-blood specificity. G1's own denominator (|ΔBLD−0.5| = 0.0106) is also small, so its SI ≈ 38 is a rough index rather than a precise ratio; the robust fact is G1's large, BH-significant DRG MRU (0.906).</w:t>
       </w:r>
     </w:p>
     <w:p>
@@ -3576,7 +3576,7 @@
         <w:t>Figure 5.</w:t>
       </w:r>
       <w:r>
-        <w:t xml:space="preserve"> Pipeline sensitivity — effect sizes (|Hedges g|, saline-arm SNI vs sham, GSE261676) for the positive control (literature-derived nerve-injury gene set), the stiffness HD_up (B-primary), HD_down (B-secondary), and HI_down (exploratory). The positive control (g = 3.85, P = 0.0286) is fully separated from HD_up (g = 0.219, P = 0.80); the ~17.6-fold gap shows the sample-level pipeline detects a real DRG signal and that the HD_up null is sensitivity-validated rather than a method failure. Source: </w:t>
+        <w:t xml:space="preserve"> Pipeline sensitivity — effect sizes (|Hedges g|, saline-arm SNI vs sham, GSE261676) for the positive control (literature-derived nerve-injury gene set), the stiffness HD_up (B-primary), HD_down (B-secondary), and HI_down (exploratory). The positive control (g = 3.85, P = 0.0286) is detected at the exact-permutation lower bound, separated from HD_up (g = 0.219, P = 0.80); the ~17.6-fold gap shows the sample-level pipeline detects a real DRG signal and that the HD_up null is sensitivity-validated rather than a method failure. Source: </w:t>
       </w:r>
       <w:r>
         <w:rPr>
@@ -3616,7 +3616,7 @@
         <w:t>S1 Fig.</w:t>
       </w:r>
       <w:r>
-        <w:t xml:space="preserve"> Layer-3b sample-level effect sizes (|Hedges g|, saline-arm SNI vs sham, GSE261676, 4 vs 4) for the positive control and seven gene sets (HD_up, G1–G5). Only the positive control is significant (g = 3.85, P = 0.0286); 0/5 ECM sets showed significant upregulation, so the Layer-3b divergence primary endpoint FAILED. The HD_up and positive-control rows reproduce the Stage B results on identical computation. Source: </w:t>
+        <w:t xml:space="preserve"> Layer-3b sample-level effect sizes (|Hedges g|, saline-arm SNI vs sham, GSE261676, 4 vs 4) for the positive control plus six gene sets (HD_up, G1–G5), seven bars in total. Only the positive control is significant (g = 3.85, P = 0.0286); 0/5 ECM sets showed significant upregulation, so the Layer-3b divergence primary endpoint FAILED. The HD_up and positive-control rows reproduce the Stage B results on identical computation. Source: </w:t>
       </w:r>
       <w:r>
         <w:rPr>

</xml_diff>

<commit_message>
De-AI polish of manuscript and cover letter: remove em-dashes, flatten formulaic phrasing (must be tempered/qualified, circumscribes, parsimoniously, We note), trim abstract to 289 words; regenerate docx + MANIFEST; gate 43/43
</commit_message>
<xml_diff>
--- a/manuscript/manuscript.docx
+++ b/manuscript/manuscript.docx
@@ -47,7 +47,7 @@
     </w:p>
     <w:p>
       <w:r>
-        <w:t>Chronic-pain transcriptomes report enrichment of broad extracellular-matrix (ECM) gene sets, but whether a stiffness-driven program engages pain-relevant tissues has never been tested with a signature whose driver is experimentally controlled. We conducted a prospectively specified, two-stage reanalysis. A YAP/TAZ–TEAD-dependent stiffness signature (HD_up 18; HD_down 41) from GSE98547 (HEK293A, 1 vs 40 kPa, four genotypes) was projected onto GSE111216 (four tissues × two pain models) and GSE261676 (mouse dorsal root ganglion [DRG], sample-level spared-nerve-injury [SNI] model); endpoints were frozen before inspecting pain data.</w:t>
+        <w:t>Chronic-pain transcriptomes keep showing enrichment of broad extracellular-matrix (ECM) gene sets, yet no one has tested, with an experimentally controlled mechanical driver, whether a stiffness-driven program reaches pain-relevant tissue. We ran a prospectively specified, two-stage reanalysis. A YAP/TAZ–TEAD-dependent stiffness signature (HD_up 18; HD_down 41) from GSE98547 (HEK293A, 1 vs 40 kPa, four genotypes) was projected onto GSE111216 (four tissues × two pain models) and GSE261676 (mouse dorsal root ganglion [DRG], sample-level spared-nerve-injury [SNI] model); we froze endpoints before seeing the pain data.</w:t>
       </w:r>
     </w:p>
     <w:p>
@@ -57,7 +57,7 @@
     </w:p>
     <w:p>
       <w:r>
-        <w:t>Using a sample-level sensitivity-validated pipeline, we show no detectable transfer of the HEK293A-derived stiffness program to pain tissues at the 4-vs-4 resolution (a sensitivity-validated, not method, null). The failure is signature- and cell-type-specific, not a universal projection artifact; once baseline-expression confounding is controlled, ECM/mechanotransduction sets retain a DRG-over-blood shift for matrisome/fibrosis (G1, G5) and mechanosensory (G3) modules. Literature "ECM enrichment in pain" is not disproven; our result circumscribes its interpretation to the projected signature's source cell type.</w:t>
+        <w:t>With a sample-level, sensitivity-validated pipeline we find no detectable transfer of the HEK293A-derived stiffness program to pain tissue at the 4-vs-4 resolution. This is a sensitivity-validated null, not a methodological one. The failure is specific to this signature and cell type, not to projection generally. Once baseline-expression confounding is controlled, established ECM/mechanotransduction sets still show a DRG-over-blood shift for matrisome/fibrosis (G1, G5) and mechanosensory (G3) modules. Our result does not disprove the literature's "ECM enrichment in pain" claim; it limits that claim to the projected signature's source cell type.</w:t>
       </w:r>
     </w:p>
     <w:p>
@@ -71,7 +71,7 @@
     </w:p>
     <w:p>
       <w:r>
-        <w:t>Neuropathic pain transcriptomes consistently show upregulation of extracellular-matrix (ECM) and mechanotransduction-related terms [2,5,7]. The prevailing interpretation is that mechanical signalling programs are engaged in injured sensory pathways. Two inferential gaps limit this conclusion. First, "ECM organization" is a broad Gene Ontology term encompassing hundreds of housekeeping collagens and glycoproteins; its enrichment does not isolate a mechanistically defined program. Second, the direction of causality is unclear: ECM changes may be downstream sequelae rather than drivers of the pain state.</w:t>
+        <w:t>Neuropathic-pain transcriptomes consistently show upregulation of extracellular-matrix (ECM) and mechanotransduction-related terms [2,5,7]. The usual reading is that mechanical-signalling programs are engaged in injured sensory pathways. Two gaps undercut that reading. First, "ECM organization" is a broad Gene Ontology term covering hundreds of housekeeping collagens and glycoproteins; its enrichment does not isolate a mechanistically defined program. Second, the direction of causality is unclear: ECM changes may be downstream sequelae rather than drivers of the pain state.</w:t>
       </w:r>
     </w:p>
     <w:p>
@@ -122,7 +122,7 @@
         <w:t>methodological</w:t>
       </w:r>
       <w:r>
-        <w:t xml:space="preserve"> null (one that would also erase real signal). That separation is the contribution of this reanalysis: it tells us, with calibration, where a controlled stiffness program does and does not engage pain transcriptomes.</w:t>
+        <w:t xml:space="preserve"> null (one that would also erase real signal). Drawing that distinction is the point of this reanalysis. It tells us, once calibrated, where a controlled stiffness program does and does not engage pain transcriptomes.</w:t>
       </w:r>
     </w:p>
     <w:p>
@@ -389,7 +389,7 @@
         <w:t>equally significant</w:t>
       </w:r>
       <w:r>
-        <w:t xml:space="preserve"> to the target; here both DRG and blood are non-significant, so the rule does not apply and Stage A is a plain double-null: no tissue-specific engagement of the HEK293A program can be claimed, but the result is also not informative about mechanism. Three P values coexist for this contrast — the full-background unstratified calibration (DRG P = 0.597, BLD P = 0.0009), the diagnostic unstratified test in the matched null space (DRG P = 0.055, BLD P = 0.085), and the expression-matched primary endpoint (DRG P = 0.102, BLD P = 0.100); only the last is pre-specified and governs the verdict. A separate, non-pre-specified unstratified calibration (full background including 40–58% zero-expression loci; baseline-zero fractions DRG 42.8%, BLD 58.5%, SC 41.0%, BRN 40.5%; Kolmogorov–Smirnov D ≈ 0.49 throughout) gave DRG P = 0.597 and BLD P = 0.0009, a pattern driven by the zero-expression confound and explicitly </w:t>
+        <w:t xml:space="preserve"> to the target; here both DRG and blood are non-significant, so the rule does not apply and Stage A is a plain double-null: no tissue-specific engagement of the HEK293A program can be claimed, but the result is also not informative about mechanism. Three P values apply to this contrast. The full-background unstratified calibration gives DRG P = 0.597 and BLD P = 0.0009; the diagnostic unstratified test in the matched null space gives DRG P = 0.055 and BLD P = 0.085; and the expression-matched primary endpoint gives DRG P = 0.102 and BLD P = 0.100. Only the last is pre-specified and governs the verdict. A separate, non-pre-specified unstratified calibration (full background including 40–58% zero-expression loci; baseline-zero fractions DRG 42.8%, BLD 58.5%, SC 41.0%, BRN 40.5%; Kolmogorov–Smirnov D ≈ 0.49 throughout) gave DRG P = 0.597 and BLD P = 0.0009, a pattern driven by the zero-expression confound and explicitly </w:t>
       </w:r>
       <w:r>
         <w:rPr>
@@ -472,7 +472,7 @@
         <w:t>sensitivity-validated</w:t>
       </w:r>
       <w:r>
-        <w:t xml:space="preserve"> rather than a method failure. We note the exact-permutation lower bound (P ≈ 0.029) means only large effects are detectable at this 4-vs-4 design, so the null is bounded at this design, not tightly bounded in absolute magnitude. HD_down reached a nominally significant but BH-non-significant (q = 0.086) reverse elevation (difference = +0.397, P = 0.0286, g = 2.658) and is reported </w:t>
+        <w:t xml:space="preserve"> rather than a method failure. The exact-permutation lower bound (P ≈ 0.029) means only large effects are detectable at this 4-vs-4 design, so the null is bounded at this design rather than tightly bounded in absolute magnitude. HD_down reached a nominally significant but BH-non-significant (q = 0.086) reverse elevation (difference = +0.397, P = 0.0286, g = 2.658) and is reported </w:t>
       </w:r>
       <w:r>
         <w:rPr>
@@ -675,7 +675,7 @@
         <w:t>not</w:t>
       </w:r>
       <w:r>
-        <w:t xml:space="preserve"> show that specificity failure is universal. Of 40 tests (5 sets × 4 tissues × 2 models), 8 survived BH correction (q &lt; 0.05), all in DRG/SC/BRN with none in blood. The "retained specificity" reading must be tempered: G1 and G5 share 10 members (43% of G5's 23), so the apparent 4/5 success partly reflects one overlapping matrisome/fibrosis module counted twice, and G4's large SI is a denominator artefact (blood MRU ≈ 0.5, |Δ| ≈ 0.0009; see Table 3 footnote); the 40 tests are not independent (G1 and G5 share 10 members), so the BH q-values remain valid (conservative under positive dependence) and the independent specificity wins are G1, G3, and G5, with G1 and G5 correlated. The stable, BH-significant signal is the DRG-over-blood shift of G1 and G5 (both q = 0.0010 and 0.0016 in DRG×SNI); G3 retains specificity by SI (1.44) but does not reach BH significance and was not upregulated at the sample level (Layer 3b).</w:t>
+        <w:t xml:space="preserve"> show that specificity failure is universal. Of 40 tests (5 sets × 4 tissues × 2 models), 8 survived BH correction (q &lt; 0.05), all in DRG/SC/BRN with none in blood. The "retained specificity" reading needs tempering. G1 and G5 share 10 members (43% of G5's 23), so the apparent 4/5 success partly reflects one overlapping matrisome/fibrosis module counted twice, and G4's large SI is a denominator artefact (blood MRU ≈ 0.5, |Δ| ≈ 0.0009; see Table 3 footnote); the 40 tests are not independent (G1 and G5 share 10 members), so the BH q-values remain valid (conservative under positive dependence) and the independent specificity wins are G1, G3, and G5, with G1 and G5 correlated. The stable, BH-significant signal is the DRG-over-blood shift of G1 and G5 (both q = 0.0010 and 0.0016 in DRG×SNI); G3 retains specificity by SI (1.44) but does not reach BH significance and was not upregulated at the sample level (Layer 3b).</w:t>
       </w:r>
     </w:p>
     <w:p>
@@ -850,7 +850,7 @@
         <w:t>sensitivity-validated at the sample level</w:t>
       </w:r>
       <w:r>
-        <w:t xml:space="preserve"> (the 17.6-fold Hedges-g gap to the positive control shows the sample-level arm is not blind, though the exact-permutation lower bound of P ≈ 0.029 means the null is bounded at this design, not tightly bounded in absolute magnitude). The Layer-3 benchmark's positive reading must be qualified: the apparent "4/5 sets retain specificity" is inflated because G1 and G5 share 10 members (one overlapping matrisome/fibrosis module counted twice) and G4's large SI is a denominator artefact (blood MRU ≈ 0.5); the stable, BH-significant signal is the DRG-over-blood shift of G1 and G5 (q = 0.0010 and 0.0016 in DRG×SNI) plus a mechanosensory signal in G3. The spurious "blood shifts more than DRG" pattern seen in the unstratified Stage A calibration is explained by baseline zero-expression confounding (40–58% of loci), which the matched null corrects.</w:t>
+        <w:t xml:space="preserve"> (the 17.6-fold Hedges-g gap to the positive control shows the sample-level arm is not blind, though the exact-permutation lower bound of P ≈ 0.029 means the null is bounded at this design, not tightly bounded in absolute magnitude). The Layer-3 benchmark's positive reading needs qualifying. The apparent "4/5 sets retain specificity" is inflated because G1 and G5 share 10 members (one overlapping matrisome/fibrosis module counted twice) and G4's large SI is a denominator artefact (blood MRU ≈ 0.5); the stable, BH-significant signal is the DRG-over-blood shift of G1 and G5 (q = 0.0010 and 0.0016 in DRG×SNI) plus a mechanosensory signal in G3. The spurious "blood shifts more than DRG" pattern seen in the unstratified Stage A calibration is explained by baseline zero-expression confounding (40–58% of loci), which the matched null corrects.</w:t>
       </w:r>
     </w:p>
     <w:p>
@@ -887,12 +887,12 @@
         <w:t>in-vivo</w:t>
       </w:r>
       <w:r>
-        <w:t xml:space="preserve"> mechanical-pain transducers, and their appearance here as a DRG-over-blood module is consistent with a possible mechanosensory engagement of injured sensory neurons and is reported as hypothesis-generating only — it rests on rank-projection specificity (SI = 1.44) and was not upregulated at the sample level (Layer 3b, G3 diff = −0.277, P = 0.286). We therefore highlight G3's ion-channel signal as the mechanistically interesting Layer-3 result, and note that the pain-relevant question is not "does any ECM program transfer?" but "which kind of mechanotransduction engages pain tissue?"</w:t>
+        <w:t xml:space="preserve"> mechanical-pain transducers, so their emergence here as a DRG-over-blood module fits a possible mechanosensory engagement of injured sensory neurons. We flag this only as a hypothesis: it rests on rank-projection specificity (SI = 1.44) and was not upregulated at the sample level (Layer 3b, G3 diff = −0.277, P = 0.286). G3's ion-channel signal is the mechanistically interesting Layer-3 result, and it reframes the pain-relevant question. The issue is not "does any ECM program transfer?" but "which kind of mechanotransduction engages pain tissue?"</w:t>
       </w:r>
     </w:p>
     <w:p>
       <w:r>
-        <w:t xml:space="preserve">We therefore revise the interpretation relative to the pre-registered hypotheses: the cross-cell-type projection of a </w:t>
+        <w:t xml:space="preserve">So we adjust the interpretation against the pre-registered hypotheses. The cross-cell-type projection of a </w:t>
       </w:r>
       <w:r>
         <w:rPr>
@@ -901,7 +901,7 @@
         <w:t>HEK293A-derived</w:t>
       </w:r>
       <w:r>
-        <w:t xml:space="preserve"> stiffness program does not transfer to mouse pain DRG/SC, and this is most parsimoniously a </w:t>
+        <w:t xml:space="preserve"> stiffness program does not transfer to mouse pain DRG/SC, and the simplest explanation is a </w:t>
       </w:r>
       <w:r>
         <w:rPr>
@@ -910,16 +910,7 @@
         <w:t>cell-type- and mechanical-input-specific</w:t>
       </w:r>
       <w:r>
-        <w:t xml:space="preserve"> limit of this particular HEK293A-derived, substrate-fibronectin-stiffness program (HEK293A epithelium ≠ sensory neuron/glia) rather than evidence that pain-ECM findings are artifacts. Our null thus </w:t>
-      </w:r>
-      <w:r>
-        <w:rPr>
-          <w:i/>
-        </w:rPr>
-        <w:t>circumscribes</w:t>
-      </w:r>
-      <w:r>
-        <w:t xml:space="preserve"> the literature's "ECM enrichment in pain" claims to the source cell type of the projected signature, without disproving them.</w:t>
+        <w:t xml:space="preserve"> limit of this particular HEK293A-derived, substrate-fibronectin-stiffness program (HEK293A epithelium ≠ sensory neuron/glia), not evidence that pain-ECM findings are artifacts. Our null therefore limits the literature's "ECM enrichment in pain" claim to the source cell type of the projected signature, without disproving it.</w:t>
       </w:r>
     </w:p>
     <w:p>
@@ -966,7 +957,7 @@
     </w:p>
     <w:p>
       <w:r>
-        <w:t xml:space="preserve">This study re-uses public data with inherent constraints: GSE111216 deposits only per-contrast summary statistics (n = 3), preventing sample-level and behavioural-covariate analysis and meaning the Layer-3 benchmark rests on small per-contrast samples; GSE261676 is a 4-vs-4 design whose exact-permutation lower bound is P ≈ 0.029. HEK293A is non-neuronal, so the signature captures a mechanistically defined (YAP/TAZ–TEAD-dependent) but not neuron-specific program; cross-species symbol mapping is required and HD_up coverage in mouse DRG was 0.611. The mechanical input also differs between the two settings: culture-substrate fibronectin stiffness versus nerve compression or perineural fibrosis in vivo. Cell-type and mechanical-input mismatches are therefore confounded and cannot be separated here. The post-hoc observation that YAP/TAZ-class targets (G2) lose their DRG-over-blood shift while the matrisome/fibrosis modules (G1, G5) and the mechanosensory module (G3) retain a DRG-over-blood shift is reported as hypothesis-generating only; G4's apparent shift is a denominator artefact (blood MRU ≈ 0.5) and is not counted as evidence. Because the Layer-3 benchmark rests on n = 3 per-contrast summary statistics and the G1/G5 modules overlap by 10 genes, its positive reading is hypothesis-generating rather than confirmatory. We are not aware of direct DRG literature that separates these programs in neuropathic pain, and independent validation is required. HD_down is likewise hypothesis-generating only. The Layer-3 primary endpoint (universal specificity failure) was not met; generality of the </w:t>
+        <w:t xml:space="preserve">This study re-uses public data with inherent constraints: GSE111216 deposits only per-contrast summary statistics (n = 3), preventing sample-level and behavioural-covariate analysis and meaning the Layer-3 benchmark rests on small per-contrast samples; GSE261676 is a 4-vs-4 design whose exact-permutation lower bound is P ≈ 0.029. HEK293A is non-neuronal, so the signature captures a mechanistically defined (YAP/TAZ–TEAD-dependent) but not neuron-specific program; cross-species symbol mapping is required and HD_up coverage in mouse DRG was 0.611. The mechanical input also differs between the two settings: culture-substrate fibronectin stiffness versus nerve compression or perineural fibrosis in vivo. Cell-type and mechanical-input mismatches are therefore confounded and cannot be separated here. The post-hoc observation that YAP/TAZ-class targets (G2) lose their DRG-over-blood shift while the matrisome/fibrosis modules (G1, G5) and the mechanosensory module (G3) retain a DRG-over-blood shift is a hypothesis, not a finding; G4's apparent shift is a denominator artefact (blood MRU ≈ 0.5) and is not counted as evidence. Because the Layer-3 benchmark rests on n = 3 per-contrast summary statistics and the G1/G5 modules overlap by 10 genes, its positive reading is hypothesis-generating rather than confirmatory. We are not aware of direct DRG literature that separates these programs in neuropathic pain, and independent validation is required. HD_down is likewise hypothesis-generating only. The Layer-3 primary endpoint (universal specificity failure) was not met; generality of the </w:t>
       </w:r>
       <w:r>
         <w:rPr>
@@ -3516,7 +3507,7 @@
         <w:t>Figure 2.</w:t>
       </w:r>
       <w:r>
-        <w:t xml:space="preserve"> Per-animal HD_down module scores (z-scored set score) across the four spared-nerve-injury (SNI) study groups — sham/saline, SNI/saline, sham/DMI, SNI/DMI — on GSE261676. Bars mark group means. This visualises the HD_down reverse-elevation secondary endpoint at the individual-animal level. Source: </w:t>
+        <w:t xml:space="preserve"> Per-animal HD_down module scores (z-scored set score) across the four spared-nerve-injury (SNI) study groups (sham/saline, SNI/saline, sham/DMI, SNI/DMI) on GSE261676. Bars mark group means. This visualises the HD_down reverse-elevation secondary endpoint at the individual-animal level. Source: </w:t>
       </w:r>
       <w:r>
         <w:rPr>
@@ -3576,7 +3567,7 @@
         <w:t>Figure 5.</w:t>
       </w:r>
       <w:r>
-        <w:t xml:space="preserve"> Pipeline sensitivity — effect sizes (|Hedges g|, saline-arm SNI vs sham, GSE261676) for the positive control (literature-derived nerve-injury gene set), the stiffness HD_up (B-primary), HD_down (B-secondary), and HI_down (exploratory). The positive control (g = 3.85, P = 0.0286) is detected at the exact-permutation lower bound, separated from HD_up (g = 0.219, P = 0.80); the ~17.6-fold gap shows the sample-level pipeline detects a real DRG signal and that the HD_up null is sensitivity-validated rather than a method failure. Source: </w:t>
+        <w:t xml:space="preserve"> Pipeline sensitivity: effect sizes (|Hedges g|, saline-arm SNI vs sham, GSE261676) for the positive control (literature-derived nerve-injury gene set), the stiffness HD_up (B-primary), HD_down (B-secondary), and HI_down (exploratory). The positive control (g = 3.85, P = 0.0286) is detected at the exact-permutation lower bound, separated from HD_up (g = 0.219, P = 0.80); the ~17.6-fold gap shows the sample-level pipeline detects a real DRG signal and that the HD_up null is sensitivity-validated rather than a method failure. Source: </w:t>
       </w:r>
       <w:r>
         <w:rPr>

</xml_diff>

<commit_message>
Round 5 drift-confirmation blind review: merge abstract to single paragraph (289 words strict / 275 filtered, PLOS-compliant); fix Discussion L83 G3 BH-significant ambiguity per A2 paste-ready; regenerate docx+MANIFEST; gate 43/43. Drift check PASS — no numeric/citation/conclusion drift from de-AI polish.
</commit_message>
<xml_diff>
--- a/manuscript/manuscript.docx
+++ b/manuscript/manuscript.docx
@@ -47,17 +47,7 @@
     </w:p>
     <w:p>
       <w:r>
-        <w:t>Chronic-pain transcriptomes keep showing enrichment of broad extracellular-matrix (ECM) gene sets, yet no one has tested, with an experimentally controlled mechanical driver, whether a stiffness-driven program reaches pain-relevant tissue. We ran a prospectively specified, two-stage reanalysis. A YAP/TAZ–TEAD-dependent stiffness signature (HD_up 18; HD_down 41) from GSE98547 (HEK293A, 1 vs 40 kPa, four genotypes) was projected onto GSE111216 (four tissues × two pain models) and GSE261676 (mouse dorsal root ganglion [DRG], sample-level spared-nerve-injury [SNI] model); we froze endpoints before seeing the pain data.</w:t>
-      </w:r>
-    </w:p>
-    <w:p>
-      <w:r>
-        <w:t>The signature was biologically anchored (CTGF Δ = +1.64, P = 9.5 × 10⁻⁶), and a sample-level positive control confirmed sensitivity (12-gene nerve-injury set: +1.285, P = 0.0286, g = 3.85). In Stage A (expression-matched calibration) DRG×SNI HD_up gave median-rank utility (MRU) = 0.717, P = 0.102, Benjamini–Hochberg (BH) q = 0.409; blood (BLD) was equally non-significant (q = 0.409); the §5.3 rule (triggered only by an equally significant control) did not apply, so Stage A is a plain double-null with no tissue-specific attribution. In Stage B HD_up produced a bounded null (+0.146, P = 0.80, g = 0.219). The failure is signature-specific: only 1/5 ECM sets lacked specificity (SI_g 0.44–240.5); G1 and G5 reached BH significance (q = 0.0010, 0.0016) but share 10 members, whereas G4's ratio is a denominator artefact.</w:t>
-      </w:r>
-    </w:p>
-    <w:p>
-      <w:r>
-        <w:t>With a sample-level, sensitivity-validated pipeline we find no detectable transfer of the HEK293A-derived stiffness program to pain tissue at the 4-vs-4 resolution. This is a sensitivity-validated null, not a methodological one. The failure is specific to this signature and cell type, not to projection generally. Once baseline-expression confounding is controlled, established ECM/mechanotransduction sets still show a DRG-over-blood shift for matrisome/fibrosis (G1, G5) and mechanosensory (G3) modules. Our result does not disprove the literature's "ECM enrichment in pain" claim; it limits that claim to the projected signature's source cell type.</w:t>
+        <w:t>Chronic-pain transcriptomes show enrichment of broad extracellular-matrix (ECM) gene sets, yet no one has tested with a controlled mechanical driver whether a stiffness-driven program reaches pain-relevant tissue. We ran a prospectively specified two-stage reanalysis. A YAP/TAZ–TEAD-dependent stiffness signature (HD_up 18; HD_down 41) from GSE98547 (HEK293A, 1 vs 40 kPa, four genotypes) was projected onto GSE111216 (four tissues × two pain models) and GSE261676 (mouse dorsal root ganglion [DRG], spared-nerve-injury [SNI] model); we froze endpoints before seeing the pain data. The signature was biologically anchored (CTGF Δ = +1.64, P = 9.5 × 10⁻⁶), and a sample-level positive control confirmed sensitivity (12-gene nerve-injury set: +1.285, P = 0.0286, g = 3.85). In Stage A DRG×SNI HD_up gave median-rank utility (MRU) = 0.717, P = 0.102, BH q = 0.409; blood (BLD) was equally non-significant (q = 0.409); the §5.3 rule (equally significant control required) did not apply, so Stage A is a plain double-null. In Stage B HD_up produced a bounded null (+0.146, P = 0.80, g = 0.219). The failure is signature-specific: only 1/5 ECM sets lacked specificity (SI_g 0.44–240.5); G1 and G5 reached BH significance (q = 0.0010, 0.0016) but share 10 members, whereas G4's ratio is a denominator artefact. With a sample-level, sensitivity-validated pipeline we find no detectable transfer of the HEK293A-derived stiffness program to pain tissue at the 4-vs-4 resolution. This is a sensitivity-validated null, not a methodological one. The failure is specific to this signature and cell type, not to projection generally. Once baseline-expression confounding is controlled, established ECM/mechanotransduction sets show a DRG-over-blood shift for matrisome/fibrosis (G1, G5) and mechanosensory (G3) modules. Our result does not disprove the literature's "ECM enrichment in pain" claim; it limits that claim to the projected signature's source cell type.</w:t>
       </w:r>
     </w:p>
     <w:p>
@@ -850,7 +840,7 @@
         <w:t>sensitivity-validated at the sample level</w:t>
       </w:r>
       <w:r>
-        <w:t xml:space="preserve"> (the 17.6-fold Hedges-g gap to the positive control shows the sample-level arm is not blind, though the exact-permutation lower bound of P ≈ 0.029 means the null is bounded at this design, not tightly bounded in absolute magnitude). The Layer-3 benchmark's positive reading needs qualifying. The apparent "4/5 sets retain specificity" is inflated because G1 and G5 share 10 members (one overlapping matrisome/fibrosis module counted twice) and G4's large SI is a denominator artefact (blood MRU ≈ 0.5); the stable, BH-significant signal is the DRG-over-blood shift of G1 and G5 (q = 0.0010 and 0.0016 in DRG×SNI) plus a mechanosensory signal in G3. The spurious "blood shifts more than DRG" pattern seen in the unstratified Stage A calibration is explained by baseline zero-expression confounding (40–58% of loci), which the matched null corrects.</w:t>
+        <w:t xml:space="preserve"> (the 17.6-fold Hedges-g gap to the positive control shows the sample-level arm is not blind, though the exact-permutation lower bound of P ≈ 0.029 means the null is bounded at this design, not tightly bounded in absolute magnitude). The Layer-3 benchmark's positive reading needs qualifying. The apparent "4/5 sets retain specificity" is inflated because G1 and G5 share 10 members (one overlapping matrisome/fibrosis module counted twice) and G4's large SI is a denominator artefact (blood MRU ≈ 0.5); the stable, BH-significant signal is the DRG-over-blood shift of G1 and G5 (q = 0.0010 and 0.0016 in DRG×SNI), and a mechanosensory signal in G3 (SI = 1.44) that retains specificity but does not reach BH significance. The spurious "blood shifts more than DRG" pattern seen in the unstratified Stage A calibration is explained by baseline zero-expression confounding (40–58% of loci), which the matched null corrects.</w:t>
       </w:r>
     </w:p>
     <w:p>

</xml_diff>

<commit_message>
Round 6 acceptance-readiness blind review: fix §5.3 governance contradiction (Stage A now 'uninformative' per cited protocol, not 'double-null'); retitle to honest matrisome/fibrosis scope; separate non-BH G3 from G1/G5; fix MRU 0-based label; add Hedges-g formula + matched-null decile + software statement; unify Layer-3b/4 endpoint label; rewrite gate assertion; trim abstract to 294 words; 0 em-dashes. Gate 43/43.
</commit_message>
<xml_diff>
--- a/manuscript/manuscript.docx
+++ b/manuscript/manuscript.docx
@@ -11,7 +11,7 @@
           <w:b/>
           <w:sz w:val="32"/>
         </w:rPr>
-        <w:t>A controlled stiffness signature does not transfer to neuropathic-pain transcriptomes, while established ECM/mechanotransduction gene sets show tissue-specific shifts</w:t>
+        <w:t>A controlled stiffness signature does not transfer to neuropathic-pain transcriptomes: a sensitivity-validated null with retained rank-projection specificity of matrisome/fibrosis gene sets</w:t>
       </w:r>
     </w:p>
     <w:p>
@@ -47,7 +47,7 @@
     </w:p>
     <w:p>
       <w:r>
-        <w:t>Chronic-pain transcriptomes show enrichment of broad extracellular-matrix (ECM) gene sets, yet no one has tested with a controlled mechanical driver whether a stiffness-driven program reaches pain-relevant tissue. We ran a prospectively specified two-stage reanalysis. A YAP/TAZ–TEAD-dependent stiffness signature (HD_up 18; HD_down 41) from GSE98547 (HEK293A, 1 vs 40 kPa, four genotypes) was projected onto GSE111216 (four tissues × two pain models) and GSE261676 (mouse dorsal root ganglion [DRG], spared-nerve-injury [SNI] model); we froze endpoints before seeing the pain data. The signature was biologically anchored (CTGF Δ = +1.64, P = 9.5 × 10⁻⁶), and a sample-level positive control confirmed sensitivity (12-gene nerve-injury set: +1.285, P = 0.0286, g = 3.85). In Stage A DRG×SNI HD_up gave median-rank utility (MRU) = 0.717, P = 0.102, BH q = 0.409; blood (BLD) was equally non-significant (q = 0.409); the §5.3 rule (equally significant control required) did not apply, so Stage A is a plain double-null. In Stage B HD_up produced a bounded null (+0.146, P = 0.80, g = 0.219). The failure is signature-specific: only 1/5 ECM sets lacked specificity (SI_g 0.44–240.5); G1 and G5 reached BH significance (q = 0.0010, 0.0016) but share 10 members, whereas G4's ratio is a denominator artefact. With a sample-level, sensitivity-validated pipeline we find no detectable transfer of the HEK293A-derived stiffness program to pain tissue at the 4-vs-4 resolution. This is a sensitivity-validated null, not a methodological one. The failure is specific to this signature and cell type, not to projection generally. Once baseline-expression confounding is controlled, established ECM/mechanotransduction sets show a DRG-over-blood shift for matrisome/fibrosis (G1, G5) and mechanosensory (G3) modules. Our result does not disprove the literature's "ECM enrichment in pain" claim; it limits that claim to the projected signature's source cell type.</w:t>
+        <w:t>Chronic-pain transcriptomes show enrichment of broad extracellular-matrix (ECM) gene sets, yet no one has tested with a controlled mechanical driver whether a stiffness program reaches pain tissue. We ran a prospectively specified two-stage reanalysis. A YAP/TAZ–TEAD-dependent stiffness signature (HD_up 18; HD_down 41) from GSE98547 (HEK293A, 1 vs 40 kPa) was projected onto GSE111216 (four tissues × two pain models) and GSE261676 (mouse DRG, SNI model), with endpoints frozen before seeing the pain data. The signature was biologically anchored (CTGF Δ = +1.64, P = 9.5 × 10⁻⁶), and a sample-level positive control confirmed sensitivity (12-gene nerve-injury set: +1.285, P = 0.0286, g = 3.85). In Stage A DRG×SNI HD_up gave MRU = 0.717, P = 0.102, q = 0.409; the blood control was statistically indistinguishable (q = 0.409), so per §5.3 Stage A is uninformative: the design cannot separate signal from the negative control, and no tissue-specific engagement can be claimed (not a negative result). In Stage B HD_up produced a bounded null (+0.146, P = 0.80, g = 0.219). The failure is signature-specific: only 1/5 ECM sets lacked specificity (SI_g 0.44–240.5); the matrisome/fibrosis module (G1, G5, overlapping by 10 genes) reached BH significance (q = 0.0010, 0.0016) while G4's ratio is a denominator artefact and G3 retained rank-projection specificity without BH significance or sample-level upregulation (hypothesis-generating). With a sample-level sensitivity-validated pipeline we find no detectable transfer of the HEK293A-derived stiffness program to pain tissue at the 4-vs-4 resolution (a signature-specific, not method, null). Once baseline-expression confounding is controlled, established ECM/mechanotransduction sets retain a DRG-over-blood shift by rank projection, limited to the matrisome/fibrosis module and a non-significant mechanosensory signal. Our result does not disprove the literature's "ECM enrichment in pain" claim; it limits that claim to the projected signature's source cell type.</w:t>
       </w:r>
     </w:p>
     <w:p>
@@ -172,16 +172,7 @@
     </w:p>
     <w:p>
       <w:r>
-        <w:t xml:space="preserve">The pre-specified primary endpoint was rank-based concordance of HD_up in DRG×SNI, using the median-rank utility (MRU = median(member rank)/(n_expressed − 1), 1-based; 0.5 = no shift) against a size- and baseline-expression-decile-matched null (without replacement, 10 000 iterations). Negative controls were BLD and BRN. The pre-specified governance rule (§5.3; deposited frozen protocol, PROTOCOL_基质刚度与神经病理性痛.md, tag v1.0.0) states that if a negative control is </w:t>
-      </w:r>
-      <w:r>
-        <w:rPr>
-          <w:i/>
-        </w:rPr>
-        <w:t>equally</w:t>
-      </w:r>
-      <w:r>
-        <w:t xml:space="preserve"> significant to the primary, tissue-specific attribution cannot be made.</w:t>
+        <w:t>The pre-specified primary endpoint was rank-based concordance of HD_up in DRG×SNI, using the median-rank utility (MRU = median(member rank)/(n_expressed − 1), where ranks are 0-based (0..n−1) so MRU spans 0..1 with 0.5 = no shift) against a size- and baseline-expression-decile-matched null (without replacement, 10 000 iterations; each draw selects one gene per signature member from the same baseline-expression decile among expressed genes). Negative controls were BLD and BRN. The pre-specified governance rule (§5.3; deposited frozen protocol, PROTOCOL_基质刚度与神经病理性痛.md, tag v1.0.0) states that if a negative control is statistically indistinguishable from (equally significant to) the primary, tissue-specific attribution cannot be made and the contrast is uninformative rather than a negative result.</w:t>
       </w:r>
     </w:p>
     <w:p>
@@ -195,7 +186,7 @@
     </w:p>
     <w:p>
       <w:r>
-        <w:t>On GSE261676, each gene was converted to CPM → log₂(CPM + 1) → per-gene cross-sample z-score; set scores were member-z means. The B-primary was the saline-arm SNI-vs-sham HD_up score difference, tested by exhaustive exact permutation over all C(8,4) = 70 possible 4-vs-4 splits (two-sided), cross-checked with Welch t and Mann–Whitney U. Hedges g provided the effect size.</w:t>
+        <w:t>On GSE261676, each gene was converted to CPM → log₂(CPM + 1) → per-gene cross-sample z-score; set scores were member-z means. The B-primary was the saline-arm SNI-vs-sham HD_up score difference, tested by exhaustive exact permutation over all C(8,4) = 70 possible 4-vs-4 splits (two-sided), cross-checked with Welch t and Mann–Whitney U. Hedges g (the small-sample bias-corrected standardized mean difference, g = J·d with J = 1 − 3/(4N−9), N the total sample size across both groups) provided the effect size.</w:t>
       </w:r>
     </w:p>
     <w:p>
@@ -370,16 +361,16 @@
         <w:t>statistically indistinguishable</w:t>
       </w:r>
       <w:r>
-        <w:t xml:space="preserve">: MRU = 0.696, P = 0.100, q = 0.409 (Table 2). The pre-specified governance rule (§5.3) is triggered only when a negative control is </w:t>
+        <w:t xml:space="preserve">: MRU = 0.696, P = 0.100, q = 0.409 (Table 2). The pre-specified governance rule (§5.3) is triggered when a negative control is statistically indistinguishable from the target; here BLD (q = 0.409) is indistinguishable from DRG (q = 0.409), so the rule applies and Stage A is </w:t>
       </w:r>
       <w:r>
         <w:rPr>
           <w:i/>
         </w:rPr>
-        <w:t>equally significant</w:t>
+        <w:t>uninformative</w:t>
       </w:r>
       <w:r>
-        <w:t xml:space="preserve"> to the target; here both DRG and blood are non-significant, so the rule does not apply and Stage A is a plain double-null: no tissue-specific engagement of the HEK293A program can be claimed, but the result is also not informative about mechanism. Three P values apply to this contrast. The full-background unstratified calibration gives DRG P = 0.597 and BLD P = 0.0009; the diagnostic unstratified test in the matched null space gives DRG P = 0.055 and BLD P = 0.085; and the expression-matched primary endpoint gives DRG P = 0.102 and BLD P = 0.100. Only the last is pre-specified and governs the verdict. A separate, non-pre-specified unstratified calibration (full background including 40–58% zero-expression loci; baseline-zero fractions DRG 42.8%, BLD 58.5%, SC 41.0%, BRN 40.5%; Kolmogorov–Smirnov D ≈ 0.49 throughout) gave DRG P = 0.597 and BLD P = 0.0009, a pattern driven by the zero-expression confound and explicitly </w:t>
+        <w:t xml:space="preserve">: the matched-null design cannot separate a true DRG signal from the blood control, so no tissue-specific engagement of the HEK293A program can be claimed; and, per §5.3, this is an uninformative (not a negative) result and must not be read as evidence of absence. Three P values apply to this contrast. The full-background unstratified calibration gives DRG P = 0.597 and BLD P = 0.0009; the diagnostic unstratified test in the matched null space gives DRG P = 0.055 and BLD P = 0.085; and the expression-matched primary endpoint gives DRG P = 0.102 and BLD P = 0.100. Only the last is pre-specified and governs the verdict. A separate, non-pre-specified unstratified calibration (full background including 40–58% zero-expression loci; baseline-zero fractions DRG 42.8%, BLD 58.5%, SC 41.0%, BRN 40.5%; Kolmogorov–Smirnov D ≈ 0.49 throughout) gave DRG P = 0.597 and BLD P = 0.0009, a pattern driven by the zero-expression confound and explicitly </w:t>
       </w:r>
       <w:r>
         <w:rPr>
@@ -665,7 +656,7 @@
         <w:t>not</w:t>
       </w:r>
       <w:r>
-        <w:t xml:space="preserve"> show that specificity failure is universal. Of 40 tests (5 sets × 4 tissues × 2 models), 8 survived BH correction (q &lt; 0.05), all in DRG/SC/BRN with none in blood. The "retained specificity" reading needs tempering. G1 and G5 share 10 members (43% of G5's 23), so the apparent 4/5 success partly reflects one overlapping matrisome/fibrosis module counted twice, and G4's large SI is a denominator artefact (blood MRU ≈ 0.5, |Δ| ≈ 0.0009; see Table 3 footnote); the 40 tests are not independent (G1 and G5 share 10 members), so the BH q-values remain valid (conservative under positive dependence) and the independent specificity wins are G1, G3, and G5, with G1 and G5 correlated. The stable, BH-significant signal is the DRG-over-blood shift of G1 and G5 (both q = 0.0010 and 0.0016 in DRG×SNI); G3 retains specificity by SI (1.44) but does not reach BH significance and was not upregulated at the sample level (Layer 3b).</w:t>
+        <w:t xml:space="preserve"> show that specificity failure is universal. Of 40 tests (5 sets × 4 tissues × 2 models), 8 survived BH correction (q &lt; 0.05), all in DRG/SC/BRN with none in blood. The "retained specificity" reading needs tempering. G1 and G5 share 10 members (43% of G5's 23), so the apparent 4/5 success partly reflects one overlapping matrisome/fibrosis module counted twice, and G4's large SI is a denominator artefact (blood MRU ≈ 0.5, |Δ| ≈ 0.0009; see Table 3 footnote); the 40 tests are not independent (G1 and G5 share 10 members), so the BH q-values remain valid (conservative under positive dependence); the independent specificity signals are the matrisome/fibrosis module (G1 and G5, which overlap by 10 genes and are therefore correlated) and the mechanosensory module G3 (non-BH, hypothesis-generating), so the apparent 4/5 success reflects two, not three, independent wins. The stable, BH-significant signal is the DRG-over-blood shift of G1 and G5 (both q = 0.0010 and 0.0016 in DRG×SNI); G3 retains specificity by SI (1.44) but does not reach BH significance and was not upregulated at the sample level (Layer 3b).</w:t>
       </w:r>
     </w:p>
     <w:p>
@@ -730,7 +721,7 @@
     </w:p>
     <w:p>
       <w:r>
-        <w:t>Layer 3b did not support a divergence pattern: 0/5 ECM sets were significantly upregulated in the saline-arm SNI-vs-sham test (Hedges g 0.31–1.13; positive control g = 3.85, P = 0.0286; HD_up g = 0.219, P = 0.80); its primary endpoint FAILED (S1 Fig). The positive-control BH q = 0.200 in Table 4 is the 7-set family adjustment at the sample level and does not contradict the Stage B sensitivity pass; only the 4-vs-4 exact P governs that endpoint. Layer 4 characterized injured DRG directly: of 15 345 tested genes, 8 were significantly upregulated (q &lt; 0.05) and 3 down; the ECM-union (G1/G4/G5) contributed 0 significant-up genes (Fisher OR = 0, P = 1.0), and HD_up members contributed 0. Layer 4's primary endpoint FAILED, confirming the descriptive landscape is not dominated by ECM-structure upregulation.</w:t>
+        <w:t>Layer 3b did not support a divergence pattern: 0/5 ECM sets were significantly upregulated in the saline-arm SNI-vs-sham test (Hedges g 0.31–1.13; positive control g = 3.85, P = 0.0286; HD_up g = 0.219, P = 0.80); its pre-specified endpoint FAILED (S1 Fig). The positive-control BH q = 0.200 in Table 4 is the 7-set family adjustment at the sample level and does not contradict the Stage B sensitivity pass; only the 4-vs-4 exact P governs that endpoint. Layer 4 characterized injured DRG directly: of 15 345 tested genes, 8 were significantly upregulated (q &lt; 0.05) and 3 down; the ECM-union (G1/G4/G5) contributed 0 significant-up genes (Fisher OR = 0, P = 1.0), and HD_up members contributed 0. Layer 4's pre-specified endpoint FAILED, confirming the descriptive landscape is not dominated by ECM-structure upregulation.</w:t>
       </w:r>
     </w:p>
     <w:p>
@@ -822,16 +813,7 @@
         <w:t>universal-failure</w:t>
       </w:r>
       <w:r>
-        <w:t xml:space="preserve"> primary was also not met. The Stage A and Layer-3/3b/4 nulls are interpreted differently: Stage A is a plain double-null (both DRG and blood non-significant, so the §5.3 rule for an </w:t>
-      </w:r>
-      <w:r>
-        <w:rPr>
-          <w:i/>
-        </w:rPr>
-        <w:t>informative</w:t>
-      </w:r>
-      <w:r>
-        <w:t xml:space="preserve"> negative control is not triggered and no tissue-specific attribution can be made); Stage B's HD_up null is </w:t>
+        <w:t xml:space="preserve"> primary was also not met. The Stage A and Layer-3/3b/4 nulls are interpreted differently: Stage A is uninformative per §5.3 (BLD q = 0.409 is indistinguishable from DRG q = 0.409, so the matched-null design cannot separate signal from negative control and no tissue-specific attribution can be made); Stage B's HD_up null is </w:t>
       </w:r>
       <w:r>
         <w:rPr>
@@ -854,7 +836,7 @@
         <w:t>rank-projection direction-of-shift specificity</w:t>
       </w:r>
       <w:r>
-        <w:t xml:space="preserve">: whether each set's membership shifts more in DRG than in blood. There, G1, G3, and G5 are affirmed, but the apparent count is inflated because G1 and G5 overlap by 10 genes and G4's ratio is unstable (see Table 3 footnote); the genuine, independent wins are G1, G3, and G5, of which G1 and G5 reach BH significance. Layer 3b and Layer 4 instead ask whether these sets are </w:t>
+        <w:t xml:space="preserve">: whether each set's membership shifts more in DRG than in blood. There, G1, G3, and G5 retain specificity, but the apparent count is inflated because G1 and G5 overlap by 10 genes and G4's ratio is unstable (see Table 3 footnote); the genuine, independent signals are the matrisome/fibrosis module (G1 and G5, correlated) and the mechanosensory module G3, of which only G1 and G5 reach BH significance. Layer 3b and Layer 4 instead ask whether these sets are </w:t>
       </w:r>
       <w:r>
         <w:rPr>
@@ -919,7 +901,7 @@
     </w:p>
     <w:p>
       <w:r>
-        <w:t xml:space="preserve">2. Projecting that signature onto pain transcriptomes yields no tissue-specific evidence of engagement (Stage A a double-null with §5.3 not triggered; Stage B a bounded null), but this is a </w:t>
+        <w:t xml:space="preserve">2. Projecting that signature onto pain transcriptomes yields no tissue-specific evidence of engagement (Stage A uninformative per §5.3, since the blood control is indistinguishable from the DRG target; Stage B HD_up a bounded null, with HD_down nominally significant but BH-non-significant and hypothesis-generating only), but this is a </w:t>
       </w:r>
       <w:r>
         <w:rPr>
@@ -933,7 +915,7 @@
     </w:p>
     <w:p>
       <w:r>
-        <w:t>3. The failure is signature- and cell-type-specific: expression-stratified projection recovers a DRG-over-blood shift for established ECM/mechanotransduction modules (G1, G5, and the mechanosensory G3), so literature "ECM enrichment in pain" findings are not invalidated by our result.</w:t>
+        <w:t>3. The failure is signature- and cell-type-specific: expression-stratified projection recovers a DRG-over-blood shift by rank projection for the matrisome/fibrosis module (G1, G5, overlapping by 10 genes) that reaches BH significance, and retains specificity for the mechanosensory module (G3, non-BH and not sample-level upregulated, hypothesis-generating); the literature "ECM enrichment in pain" findings are therefore not invalidated by our result.</w:t>
       </w:r>
     </w:p>
     <w:p>
@@ -996,7 +978,7 @@
         <w:t>analysis/results/</w:t>
       </w:r>
       <w:r>
-        <w:t>. The CTGF Δ and P reported as the Layer-0 biological anchor are recomputed from the regenerated wild-type stiffness contrast; the per-replicate FPKM source for GSE98547 is deposited so the anchor is fully reproducible.</w:t>
+        <w:t>. Analysis was performed in Python 3.13 (numpy, pandas) with a fixed random seed (20261021) for all permutations and matched-null draws; scripts and environment are deposited at the repository. The CTGF Δ and P reported as the Layer-0 biological anchor are recomputed from the regenerated wild-type stiffness contrast; the per-replicate FPKM source for GSE98547 is deposited so the anchor is fully reproducible.</w:t>
       </w:r>
     </w:p>
     <w:p>
@@ -1480,7 +1462,7 @@
           <w:p>
             <w:r/>
             <w:r>
-              <w:t>not sig; blood control equally non-significant (MRU = 0.696, P = 0.100, q = 0.409)</w:t>
+              <w:t>not sig; blood control indistinguishable (MRU = 0.696, P = 0.100, q = 0.409)</w:t>
             </w:r>
           </w:p>
         </w:tc>
@@ -1491,7 +1473,7 @@
           <w:p>
             <w:r/>
             <w:r>
-              <w:t>§5.3 not triggered (double null)</w:t>
+              <w:t>§5.3 triggered → uninformative (control q = 0.409 = target q = 0.409)</w:t>
             </w:r>
           </w:p>
         </w:tc>
@@ -1734,7 +1716,7 @@
           <w:p>
             <w:r/>
             <w:r>
-              <w:t>Layer 3b primary (divergence)</w:t>
+              <w:t>Layer 3b pre-specified endpoint (divergence)</w:t>
             </w:r>
           </w:p>
         </w:tc>
@@ -1767,7 +1749,7 @@
           <w:p>
             <w:r/>
             <w:r>
-              <w:t>primary FAIL</w:t>
+              <w:t>FAIL</w:t>
             </w:r>
           </w:p>
         </w:tc>
@@ -1780,7 +1762,7 @@
           <w:p>
             <w:r/>
             <w:r>
-              <w:t>Layer 4 primary (positive characterisation)</w:t>
+              <w:t>Layer 4 pre-specified endpoint (positive characterisation)</w:t>
             </w:r>
           </w:p>
         </w:tc>
@@ -1813,7 +1795,7 @@
           <w:p>
             <w:r/>
             <w:r>
-              <w:t>primary FAIL</w:t>
+              <w:t>FAIL</w:t>
             </w:r>
           </w:p>
         </w:tc>
@@ -3577,7 +3559,7 @@
         <w:t>Figure 6.</w:t>
       </w:r>
       <w:r>
-        <w:t xml:space="preserve"> Layer-3 generality benchmark. Log-scaled bar chart of the specificity index SI_g = |MRU(DRG,SNI) − 0.5| / |MRU(blood,SNI) − 0.5| for the five independent ECM/mechanotransduction gene sets (G1–G5); SI_g &lt; 1 (red) denotes failure of tissue specificity, SI_g ≥ 1 (blue) denotes retention. G2 (YAP/TAZ canonical targets) fails (SI_g = 0.44); G1, G3, G4, G5 appear to pass. Caveat: G1 and G5 share 10 members (one overlapping module counted twice) and G4's large SI_g is a denominator artefact (blood MRU ≈ 0.5), so the apparent "4/5 pass" is inflated. Source: </w:t>
+        <w:t xml:space="preserve"> Layer-3 generality benchmark. Log-scaled bar chart of the specificity index SI_g = |MRU(DRG,SNI) − 0.5| / |MRU(blood,SNI) − 0.5| for the five independent ECM/mechanotransduction gene sets (G1–G5); SI_g &lt; 1 (red) denotes failure of tissue specificity, SI_g ≥ 1 (blue) denotes retention. G2 (YAP/TAZ canonical targets) fails (SI_g = 0.44); G1, G3, G4, G5 appear to pass. Caveat: G1 and G5 share 10 members (one overlapping module counted twice) and G4's large SI_g is a denominator artefact (blood MRU ≈ 0.5, so its bar is not reliable); the apparent "4/5 pass" is inflated. Source: </w:t>
       </w:r>
       <w:r>
         <w:rPr>

</xml_diff>